<commit_message>
Actualiza db y plantilla de cotización
</commit_message>
<xml_diff>
--- a/api-cotizaciones/templates/Plantilla_Cotizacion.docx
+++ b/api-cotizaciones/templates/Plantilla_Cotizacion.docx
@@ -8863,7 +8863,27 @@
                 <w:sz w:val="14"/>
                 <w:szCs w:val="14"/>
               </w:rPr>
-              <w:t>{{reembolso48}}</w:t>
+              <w:t>{{reembolso</w:t>
+            </w:r>
+            <w:r>
+              <w:rPr>
+                <w:rFonts w:ascii="Noto Sans" w:hAnsi="Noto Sans" w:cs="Noto Sans"/>
+                <w:i/>
+                <w:iCs/>
+                <w:sz w:val="14"/>
+                <w:szCs w:val="14"/>
+              </w:rPr>
+              <w:t>60</w:t>
+            </w:r>
+            <w:r>
+              <w:rPr>
+                <w:rFonts w:ascii="Noto Sans" w:hAnsi="Noto Sans" w:cs="Noto Sans"/>
+                <w:i/>
+                <w:iCs/>
+                <w:sz w:val="14"/>
+                <w:szCs w:val="14"/>
+              </w:rPr>
+              <w:t>}}</w:t>
             </w:r>
           </w:p>
         </w:tc>
@@ -9361,7 +9381,39 @@
           <w:sz w:val="14"/>
           <w:szCs w:val="14"/>
         </w:rPr>
-        <w:t>Los gastos por derechos vehiculares, así como los costos de mantenimiento preventivo del vehículo, no se encuentran incluidos.</w:t>
+        <w:t>Los gastos por derechos vehiculares, así como los costos de mantenimiento preventivo del vehículo</w:t>
+      </w:r>
+      <w:r>
+        <w:rPr>
+          <w:rFonts w:ascii="Noto Sans" w:hAnsi="Noto Sans" w:cs="Noto Sans"/>
+          <w:sz w:val="14"/>
+          <w:szCs w:val="14"/>
+        </w:rPr>
+        <w:t>,</w:t>
+      </w:r>
+      <w:r>
+        <w:rPr>
+          <w:rFonts w:ascii="Noto Sans" w:hAnsi="Noto Sans" w:cs="Noto Sans"/>
+          <w:sz w:val="14"/>
+          <w:szCs w:val="14"/>
+        </w:rPr>
+        <w:t xml:space="preserve"> </w:t>
+      </w:r>
+      <w:r>
+        <w:rPr>
+          <w:rFonts w:ascii="Noto Sans" w:hAnsi="Noto Sans" w:cs="Noto Sans"/>
+          <w:sz w:val="14"/>
+          <w:szCs w:val="14"/>
+        </w:rPr>
+        <w:t>no están</w:t>
+      </w:r>
+      <w:r>
+        <w:rPr>
+          <w:rFonts w:ascii="Noto Sans" w:hAnsi="Noto Sans" w:cs="Noto Sans"/>
+          <w:sz w:val="14"/>
+          <w:szCs w:val="14"/>
+        </w:rPr>
+        <w:t xml:space="preserve"> incluidos.</w:t>
       </w:r>
     </w:p>
     <w:p>
@@ -11151,12 +11203,14 @@
 </file>
 
 <file path=customXml/item1.xml><?xml version="1.0" encoding="utf-8"?>
-<?mso-contentType ?>
-<FormTemplates xmlns="http://schemas.microsoft.com/sharepoint/v3/contenttype/forms">
-  <Display>DocumentLibraryForm</Display>
-  <Edit>DocumentLibraryForm</Edit>
-  <New>DocumentLibraryForm</New>
-</FormTemplates>
+<p:properties xmlns:p="http://schemas.microsoft.com/office/2006/metadata/properties" xmlns:xsi="http://www.w3.org/2001/XMLSchema-instance" xmlns:pc="http://schemas.microsoft.com/office/infopath/2007/PartnerControls">
+  <documentManagement>
+    <TaxCatchAll xmlns="28d91c81-3320-4acb-8eaa-397b4c3aa27d" xsi:nil="true"/>
+    <lcf76f155ced4ddcb4097134ff3c332f xmlns="67d34832-0f6e-4f48-b623-8e6599d3f193">
+      <Terms xmlns="http://schemas.microsoft.com/office/infopath/2007/PartnerControls"/>
+    </lcf76f155ced4ddcb4097134ff3c332f>
+  </documentManagement>
+</p:properties>
 </file>
 
 <file path=customXml/item2.xml><?xml version="1.0" encoding="utf-8"?>
@@ -11415,20 +11469,21 @@
 </file>
 
 <file path=customXml/item3.xml><?xml version="1.0" encoding="utf-8"?>
-<p:properties xmlns:p="http://schemas.microsoft.com/office/2006/metadata/properties" xmlns:xsi="http://www.w3.org/2001/XMLSchema-instance" xmlns:pc="http://schemas.microsoft.com/office/infopath/2007/PartnerControls">
-  <documentManagement>
-    <TaxCatchAll xmlns="28d91c81-3320-4acb-8eaa-397b4c3aa27d" xsi:nil="true"/>
-    <lcf76f155ced4ddcb4097134ff3c332f xmlns="67d34832-0f6e-4f48-b623-8e6599d3f193">
-      <Terms xmlns="http://schemas.microsoft.com/office/infopath/2007/PartnerControls"/>
-    </lcf76f155ced4ddcb4097134ff3c332f>
-  </documentManagement>
-</p:properties>
+<?mso-contentType ?>
+<FormTemplates xmlns="http://schemas.microsoft.com/sharepoint/v3/contenttype/forms">
+  <Display>DocumentLibraryForm</Display>
+  <Edit>DocumentLibraryForm</Edit>
+  <New>DocumentLibraryForm</New>
+</FormTemplates>
 </file>
 
 <file path=customXml/itemProps1.xml><?xml version="1.0" encoding="utf-8"?>
-<ds:datastoreItem xmlns:ds="http://schemas.openxmlformats.org/officeDocument/2006/customXml" ds:itemID="{9D305735-070E-403E-93D1-14A21296DD3F}">
+<ds:datastoreItem xmlns:ds="http://schemas.openxmlformats.org/officeDocument/2006/customXml" ds:itemID="{1CD89225-DC72-4085-AD2F-3338BC9C5280}">
   <ds:schemaRefs>
-    <ds:schemaRef ds:uri="http://schemas.microsoft.com/sharepoint/v3/contenttype/forms"/>
+    <ds:schemaRef ds:uri="http://schemas.microsoft.com/office/2006/metadata/properties"/>
+    <ds:schemaRef ds:uri="http://schemas.microsoft.com/office/infopath/2007/PartnerControls"/>
+    <ds:schemaRef ds:uri="28d91c81-3320-4acb-8eaa-397b4c3aa27d"/>
+    <ds:schemaRef ds:uri="67d34832-0f6e-4f48-b623-8e6599d3f193"/>
   </ds:schemaRefs>
 </ds:datastoreItem>
 </file>
@@ -11453,12 +11508,9 @@
 </file>
 
 <file path=customXml/itemProps3.xml><?xml version="1.0" encoding="utf-8"?>
-<ds:datastoreItem xmlns:ds="http://schemas.openxmlformats.org/officeDocument/2006/customXml" ds:itemID="{1CD89225-DC72-4085-AD2F-3338BC9C5280}">
+<ds:datastoreItem xmlns:ds="http://schemas.openxmlformats.org/officeDocument/2006/customXml" ds:itemID="{9D305735-070E-403E-93D1-14A21296DD3F}">
   <ds:schemaRefs>
-    <ds:schemaRef ds:uri="http://schemas.microsoft.com/office/2006/metadata/properties"/>
-    <ds:schemaRef ds:uri="http://schemas.microsoft.com/office/infopath/2007/PartnerControls"/>
-    <ds:schemaRef ds:uri="28d91c81-3320-4acb-8eaa-397b4c3aa27d"/>
-    <ds:schemaRef ds:uri="67d34832-0f6e-4f48-b623-8e6599d3f193"/>
+    <ds:schemaRef ds:uri="http://schemas.microsoft.com/sharepoint/v3/contenttype/forms"/>
   </ds:schemaRefs>
 </ds:datastoreItem>
 </file>
</xml_diff>

<commit_message>
Actualiza db y plantilla de cotización 2
</commit_message>
<xml_diff>
--- a/api-cotizaciones/templates/Plantilla_Cotizacion.docx
+++ b/api-cotizaciones/templates/Plantilla_Cotizacion.docx
@@ -8863,27 +8863,7 @@
                 <w:sz w:val="14"/>
                 <w:szCs w:val="14"/>
               </w:rPr>
-              <w:t>{{reembolso</w:t>
-            </w:r>
-            <w:r>
-              <w:rPr>
-                <w:rFonts w:ascii="Noto Sans" w:hAnsi="Noto Sans" w:cs="Noto Sans"/>
-                <w:i/>
-                <w:iCs/>
-                <w:sz w:val="14"/>
-                <w:szCs w:val="14"/>
-              </w:rPr>
-              <w:t>60</w:t>
-            </w:r>
-            <w:r>
-              <w:rPr>
-                <w:rFonts w:ascii="Noto Sans" w:hAnsi="Noto Sans" w:cs="Noto Sans"/>
-                <w:i/>
-                <w:iCs/>
-                <w:sz w:val="14"/>
-                <w:szCs w:val="14"/>
-              </w:rPr>
-              <w:t>}}</w:t>
+              <w:t>{{reembolso60}}</w:t>
             </w:r>
           </w:p>
         </w:tc>
@@ -9558,29 +9538,7 @@
           <w:sz w:val="14"/>
           <w:szCs w:val="14"/>
         </w:rPr>
-        <w:t xml:space="preserve">Para cualquier duda o aclaración escríbenos a info@firstlease.com.mx o </w:t>
-      </w:r>
-      <w:proofErr w:type="spellStart"/>
-      <w:r>
-        <w:rPr>
-          <w:rFonts w:ascii="Noto Sans" w:hAnsi="Noto Sans" w:cs="Noto Sans"/>
-          <w:b/>
-          <w:bCs/>
-          <w:sz w:val="14"/>
-          <w:szCs w:val="14"/>
-        </w:rPr>
-        <w:t>llama</w:t>
-      </w:r>
-      <w:proofErr w:type="spellEnd"/>
-      <w:r>
-        <w:rPr>
-          <w:rFonts w:ascii="Noto Sans" w:hAnsi="Noto Sans" w:cs="Noto Sans"/>
-          <w:b/>
-          <w:bCs/>
-          <w:sz w:val="14"/>
-          <w:szCs w:val="14"/>
-        </w:rPr>
-        <w:t xml:space="preserve"> al teléfono (55) 5160-5604</w:t>
+        <w:t>Para cualquier duda o aclaración escríbenos a info@firstlease.com.mx o llama al teléfono (55) 5160-5604</w:t>
       </w:r>
     </w:p>
     <w:p>
@@ -11203,14 +11161,12 @@
 </file>
 
 <file path=customXml/item1.xml><?xml version="1.0" encoding="utf-8"?>
-<p:properties xmlns:p="http://schemas.microsoft.com/office/2006/metadata/properties" xmlns:xsi="http://www.w3.org/2001/XMLSchema-instance" xmlns:pc="http://schemas.microsoft.com/office/infopath/2007/PartnerControls">
-  <documentManagement>
-    <TaxCatchAll xmlns="28d91c81-3320-4acb-8eaa-397b4c3aa27d" xsi:nil="true"/>
-    <lcf76f155ced4ddcb4097134ff3c332f xmlns="67d34832-0f6e-4f48-b623-8e6599d3f193">
-      <Terms xmlns="http://schemas.microsoft.com/office/infopath/2007/PartnerControls"/>
-    </lcf76f155ced4ddcb4097134ff3c332f>
-  </documentManagement>
-</p:properties>
+<?mso-contentType ?>
+<FormTemplates xmlns="http://schemas.microsoft.com/sharepoint/v3/contenttype/forms">
+  <Display>DocumentLibraryForm</Display>
+  <Edit>DocumentLibraryForm</Edit>
+  <New>DocumentLibraryForm</New>
+</FormTemplates>
 </file>
 
 <file path=customXml/item2.xml><?xml version="1.0" encoding="utf-8"?>
@@ -11469,21 +11425,20 @@
 </file>
 
 <file path=customXml/item3.xml><?xml version="1.0" encoding="utf-8"?>
-<?mso-contentType ?>
-<FormTemplates xmlns="http://schemas.microsoft.com/sharepoint/v3/contenttype/forms">
-  <Display>DocumentLibraryForm</Display>
-  <Edit>DocumentLibraryForm</Edit>
-  <New>DocumentLibraryForm</New>
-</FormTemplates>
+<p:properties xmlns:p="http://schemas.microsoft.com/office/2006/metadata/properties" xmlns:xsi="http://www.w3.org/2001/XMLSchema-instance" xmlns:pc="http://schemas.microsoft.com/office/infopath/2007/PartnerControls">
+  <documentManagement>
+    <TaxCatchAll xmlns="28d91c81-3320-4acb-8eaa-397b4c3aa27d" xsi:nil="true"/>
+    <lcf76f155ced4ddcb4097134ff3c332f xmlns="67d34832-0f6e-4f48-b623-8e6599d3f193">
+      <Terms xmlns="http://schemas.microsoft.com/office/infopath/2007/PartnerControls"/>
+    </lcf76f155ced4ddcb4097134ff3c332f>
+  </documentManagement>
+</p:properties>
 </file>
 
 <file path=customXml/itemProps1.xml><?xml version="1.0" encoding="utf-8"?>
-<ds:datastoreItem xmlns:ds="http://schemas.openxmlformats.org/officeDocument/2006/customXml" ds:itemID="{1CD89225-DC72-4085-AD2F-3338BC9C5280}">
+<ds:datastoreItem xmlns:ds="http://schemas.openxmlformats.org/officeDocument/2006/customXml" ds:itemID="{9D305735-070E-403E-93D1-14A21296DD3F}">
   <ds:schemaRefs>
-    <ds:schemaRef ds:uri="http://schemas.microsoft.com/office/2006/metadata/properties"/>
-    <ds:schemaRef ds:uri="http://schemas.microsoft.com/office/infopath/2007/PartnerControls"/>
-    <ds:schemaRef ds:uri="28d91c81-3320-4acb-8eaa-397b4c3aa27d"/>
-    <ds:schemaRef ds:uri="67d34832-0f6e-4f48-b623-8e6599d3f193"/>
+    <ds:schemaRef ds:uri="http://schemas.microsoft.com/sharepoint/v3/contenttype/forms"/>
   </ds:schemaRefs>
 </ds:datastoreItem>
 </file>
@@ -11508,9 +11463,12 @@
 </file>
 
 <file path=customXml/itemProps3.xml><?xml version="1.0" encoding="utf-8"?>
-<ds:datastoreItem xmlns:ds="http://schemas.openxmlformats.org/officeDocument/2006/customXml" ds:itemID="{9D305735-070E-403E-93D1-14A21296DD3F}">
+<ds:datastoreItem xmlns:ds="http://schemas.openxmlformats.org/officeDocument/2006/customXml" ds:itemID="{1CD89225-DC72-4085-AD2F-3338BC9C5280}">
   <ds:schemaRefs>
-    <ds:schemaRef ds:uri="http://schemas.microsoft.com/sharepoint/v3/contenttype/forms"/>
+    <ds:schemaRef ds:uri="http://schemas.microsoft.com/office/2006/metadata/properties"/>
+    <ds:schemaRef ds:uri="http://schemas.microsoft.com/office/infopath/2007/PartnerControls"/>
+    <ds:schemaRef ds:uri="28d91c81-3320-4acb-8eaa-397b4c3aa27d"/>
+    <ds:schemaRef ds:uri="67d34832-0f6e-4f48-b623-8e6599d3f193"/>
   </ds:schemaRefs>
 </ds:datastoreItem>
 </file>
</xml_diff>

<commit_message>
Actualiza plantilla de cotizacion
</commit_message>
<xml_diff>
--- a/api-cotizaciones/templates/Plantilla_Cotizacion.docx
+++ b/api-cotizaciones/templates/Plantilla_Cotizacion.docx
@@ -1,6 +1,6 @@
 
 <file path=word/document.xml><?xml version="1.0" encoding="utf-8"?>
-<w:document xmlns:wpc="http://schemas.microsoft.com/office/word/2010/wordprocessingCanvas" xmlns:cx="http://schemas.microsoft.com/office/drawing/2014/chartex" xmlns:cx1="http://schemas.microsoft.com/office/drawing/2015/9/8/chartex" xmlns:cx2="http://schemas.microsoft.com/office/drawing/2015/10/21/chartex" xmlns:cx3="http://schemas.microsoft.com/office/drawing/2016/5/9/chartex" xmlns:cx4="http://schemas.microsoft.com/office/drawing/2016/5/10/chartex" xmlns:cx5="http://schemas.microsoft.com/office/drawing/2016/5/11/chartex" xmlns:cx6="http://schemas.microsoft.com/office/drawing/2016/5/12/chartex" xmlns:cx7="http://schemas.microsoft.com/office/drawing/2016/5/13/chartex" xmlns:cx8="http://schemas.microsoft.com/office/drawing/2016/5/14/chartex" xmlns:mc="http://schemas.openxmlformats.org/markup-compatibility/2006" xmlns:aink="http://schemas.microsoft.com/office/drawing/2016/ink" xmlns:am3d="http://schemas.microsoft.com/office/drawing/2017/model3d" xmlns:o="urn:schemas-microsoft-com:office:office" xmlns:oel="http://schemas.microsoft.com/office/2019/extlst" xmlns:r="http://schemas.openxmlformats.org/officeDocument/2006/relationships" xmlns:m="http://schemas.openxmlformats.org/officeDocument/2006/math" xmlns:v="urn:schemas-microsoft-com:vml" xmlns:wp14="http://schemas.microsoft.com/office/word/2010/wordprocessingDrawing" xmlns:wp="http://schemas.openxmlformats.org/drawingml/2006/wordprocessingDrawing" xmlns:w10="urn:schemas-microsoft-com:office:word" xmlns:w="http://schemas.openxmlformats.org/wordprocessingml/2006/main" xmlns:w14="http://schemas.microsoft.com/office/word/2010/wordml" xmlns:w15="http://schemas.microsoft.com/office/word/2012/wordml" xmlns:w16cex="http://schemas.microsoft.com/office/word/2018/wordml/cex" xmlns:w16cid="http://schemas.microsoft.com/office/word/2016/wordml/cid" xmlns:w16="http://schemas.microsoft.com/office/word/2018/wordml" xmlns:w16du="http://schemas.microsoft.com/office/word/2023/wordml/word16du" xmlns:w16sdtdh="http://schemas.microsoft.com/office/word/2020/wordml/sdtdatahash" xmlns:w16sdtfl="http://schemas.microsoft.com/office/word/2024/wordml/sdtformatlock" xmlns:w16se="http://schemas.microsoft.com/office/word/2015/wordml/symex" xmlns:wpg="http://schemas.microsoft.com/office/word/2010/wordprocessingGroup" xmlns:wpi="http://schemas.microsoft.com/office/word/2010/wordprocessingInk" xmlns:wne="http://schemas.microsoft.com/office/word/2006/wordml" xmlns:wps="http://schemas.microsoft.com/office/word/2010/wordprocessingShape" mc:Ignorable="w14 w15 w16se w16cid w16 w16cex w16sdtdh w16sdtfl w16du wp14">
+<w:document xmlns:wpc="http://schemas.microsoft.com/office/word/2010/wordprocessingCanvas" xmlns:cx="http://schemas.microsoft.com/office/drawing/2014/chartex" xmlns:cx1="http://schemas.microsoft.com/office/drawing/2015/9/8/chartex" xmlns:cx2="http://schemas.microsoft.com/office/drawing/2015/10/21/chartex" xmlns:cx3="http://schemas.microsoft.com/office/drawing/2016/5/9/chartex" xmlns:cx4="http://schemas.microsoft.com/office/drawing/2016/5/10/chartex" xmlns:cx5="http://schemas.microsoft.com/office/drawing/2016/5/11/chartex" xmlns:cx6="http://schemas.microsoft.com/office/drawing/2016/5/12/chartex" xmlns:cx7="http://schemas.microsoft.com/office/drawing/2016/5/13/chartex" xmlns:cx8="http://schemas.microsoft.com/office/drawing/2016/5/14/chartex" xmlns:mc="http://schemas.openxmlformats.org/markup-compatibility/2006" xmlns:aink="http://schemas.microsoft.com/office/drawing/2016/ink" xmlns:am3d="http://schemas.microsoft.com/office/drawing/2017/model3d" xmlns:o="urn:schemas-microsoft-com:office:office" xmlns:oel="http://schemas.microsoft.com/office/2019/extlst" xmlns:r="http://schemas.openxmlformats.org/officeDocument/2006/relationships" xmlns:m="http://schemas.openxmlformats.org/officeDocument/2006/math" xmlns:v="urn:schemas-microsoft-com:vml" xmlns:wp14="http://schemas.microsoft.com/office/word/2010/wordprocessingDrawing" xmlns:wp="http://schemas.openxmlformats.org/drawingml/2006/wordprocessingDrawing" xmlns:w10="urn:schemas-microsoft-com:office:word" xmlns:w="http://schemas.openxmlformats.org/wordprocessingml/2006/main" xmlns:w14="http://schemas.microsoft.com/office/word/2010/wordml" xmlns:w15="http://schemas.microsoft.com/office/word/2012/wordml" xmlns:w16cei="http://schemas.microsoft.com/office/word/2026/wordml/cei" xmlns:w16cex="http://schemas.microsoft.com/office/word/2018/wordml/cex" xmlns:w16cid="http://schemas.microsoft.com/office/word/2016/wordml/cid" xmlns:w16="http://schemas.microsoft.com/office/word/2018/wordml" xmlns:w16du="http://schemas.microsoft.com/office/word/2023/wordml/word16du" xmlns:w16sdtdh="http://schemas.microsoft.com/office/word/2020/wordml/sdtdatahash" xmlns:w16sdtfl="http://schemas.microsoft.com/office/word/2024/wordml/sdtformatlock" xmlns:w16se="http://schemas.microsoft.com/office/word/2015/wordml/symex" xmlns:wpg="http://schemas.microsoft.com/office/word/2010/wordprocessingGroup" xmlns:wpi="http://schemas.microsoft.com/office/word/2010/wordprocessingInk" xmlns:wne="http://schemas.microsoft.com/office/word/2006/wordml" xmlns:wps="http://schemas.microsoft.com/office/word/2010/wordprocessingShape" mc:Ignorable="w14 w15 w16se w16cid w16 w16cex w16sdtdh w16sdtfl w16du wp14">
   <w:body>
     <w:tbl>
       <w:tblPr>
@@ -562,7 +562,25 @@
                 <w:sz w:val="14"/>
                 <w:szCs w:val="14"/>
               </w:rPr>
-              <w:t>{{descripcion}}</w:t>
+              <w:t>{{</w:t>
+            </w:r>
+            <w:proofErr w:type="spellStart"/>
+            <w:r>
+              <w:rPr>
+                <w:rFonts w:ascii="Noto Sans" w:hAnsi="Noto Sans" w:cs="Noto Sans"/>
+                <w:sz w:val="14"/>
+                <w:szCs w:val="14"/>
+              </w:rPr>
+              <w:t>descripcion</w:t>
+            </w:r>
+            <w:proofErr w:type="spellEnd"/>
+            <w:r>
+              <w:rPr>
+                <w:rFonts w:ascii="Noto Sans" w:hAnsi="Noto Sans" w:cs="Noto Sans"/>
+                <w:sz w:val="14"/>
+                <w:szCs w:val="14"/>
+              </w:rPr>
+              <w:t>}}</w:t>
             </w:r>
           </w:p>
         </w:tc>
@@ -633,7 +651,25 @@
                 <w:sz w:val="14"/>
                 <w:szCs w:val="14"/>
               </w:rPr>
-              <w:t>{{gestbool}}</w:t>
+              <w:t>{{</w:t>
+            </w:r>
+            <w:proofErr w:type="spellStart"/>
+            <w:r>
+              <w:rPr>
+                <w:rFonts w:ascii="Noto Sans" w:hAnsi="Noto Sans" w:cs="Noto Sans"/>
+                <w:sz w:val="14"/>
+                <w:szCs w:val="14"/>
+              </w:rPr>
+              <w:t>gestbool</w:t>
+            </w:r>
+            <w:proofErr w:type="spellEnd"/>
+            <w:r>
+              <w:rPr>
+                <w:rFonts w:ascii="Noto Sans" w:hAnsi="Noto Sans" w:cs="Noto Sans"/>
+                <w:sz w:val="14"/>
+                <w:szCs w:val="14"/>
+              </w:rPr>
+              <w:t>}}</w:t>
             </w:r>
           </w:p>
         </w:tc>
@@ -716,7 +752,25 @@
                 <w:sz w:val="14"/>
                 <w:szCs w:val="14"/>
               </w:rPr>
-              <w:t>{{segurotag}}</w:t>
+              <w:t>{{</w:t>
+            </w:r>
+            <w:proofErr w:type="spellStart"/>
+            <w:r>
+              <w:rPr>
+                <w:rFonts w:ascii="Noto Sans" w:hAnsi="Noto Sans" w:cs="Noto Sans"/>
+                <w:sz w:val="14"/>
+                <w:szCs w:val="14"/>
+              </w:rPr>
+              <w:t>segurotag</w:t>
+            </w:r>
+            <w:proofErr w:type="spellEnd"/>
+            <w:r>
+              <w:rPr>
+                <w:rFonts w:ascii="Noto Sans" w:hAnsi="Noto Sans" w:cs="Noto Sans"/>
+                <w:sz w:val="14"/>
+                <w:szCs w:val="14"/>
+              </w:rPr>
+              <w:t>}}</w:t>
             </w:r>
           </w:p>
         </w:tc>
@@ -742,7 +796,25 @@
                 <w:sz w:val="14"/>
                 <w:szCs w:val="14"/>
               </w:rPr>
-              <w:t>{{segbool}}</w:t>
+              <w:t>{{</w:t>
+            </w:r>
+            <w:proofErr w:type="spellStart"/>
+            <w:r>
+              <w:rPr>
+                <w:rFonts w:ascii="Noto Sans" w:hAnsi="Noto Sans" w:cs="Noto Sans"/>
+                <w:sz w:val="14"/>
+                <w:szCs w:val="14"/>
+              </w:rPr>
+              <w:t>segbool</w:t>
+            </w:r>
+            <w:proofErr w:type="spellEnd"/>
+            <w:r>
+              <w:rPr>
+                <w:rFonts w:ascii="Noto Sans" w:hAnsi="Noto Sans" w:cs="Noto Sans"/>
+                <w:sz w:val="14"/>
+                <w:szCs w:val="14"/>
+              </w:rPr>
+              <w:t>}}</w:t>
             </w:r>
           </w:p>
         </w:tc>
@@ -871,7 +943,25 @@
                 <w:sz w:val="14"/>
                 <w:szCs w:val="14"/>
               </w:rPr>
-              <w:t>{{autobool}}</w:t>
+              <w:t>{{</w:t>
+            </w:r>
+            <w:proofErr w:type="spellStart"/>
+            <w:r>
+              <w:rPr>
+                <w:rFonts w:ascii="Noto Sans" w:hAnsi="Noto Sans" w:cs="Noto Sans"/>
+                <w:sz w:val="14"/>
+                <w:szCs w:val="14"/>
+              </w:rPr>
+              <w:t>autobool</w:t>
+            </w:r>
+            <w:proofErr w:type="spellEnd"/>
+            <w:r>
+              <w:rPr>
+                <w:rFonts w:ascii="Noto Sans" w:hAnsi="Noto Sans" w:cs="Noto Sans"/>
+                <w:sz w:val="14"/>
+                <w:szCs w:val="14"/>
+              </w:rPr>
+              <w:t>}}</w:t>
             </w:r>
           </w:p>
         </w:tc>
@@ -1008,7 +1098,25 @@
                 <w:sz w:val="14"/>
                 <w:szCs w:val="14"/>
               </w:rPr>
-              <w:t>{{asistenciabool}}</w:t>
+              <w:t>{{</w:t>
+            </w:r>
+            <w:proofErr w:type="spellStart"/>
+            <w:r>
+              <w:rPr>
+                <w:rFonts w:ascii="Noto Sans" w:hAnsi="Noto Sans" w:cs="Noto Sans"/>
+                <w:sz w:val="14"/>
+                <w:szCs w:val="14"/>
+              </w:rPr>
+              <w:t>asistenciabool</w:t>
+            </w:r>
+            <w:proofErr w:type="spellEnd"/>
+            <w:r>
+              <w:rPr>
+                <w:rFonts w:ascii="Noto Sans" w:hAnsi="Noto Sans" w:cs="Noto Sans"/>
+                <w:sz w:val="14"/>
+                <w:szCs w:val="14"/>
+              </w:rPr>
+              <w:t>}}</w:t>
             </w:r>
           </w:p>
         </w:tc>
@@ -1068,7 +1176,25 @@
                 <w:sz w:val="14"/>
                 <w:szCs w:val="14"/>
               </w:rPr>
-              <w:t>${{ptotal}}</w:t>
+              <w:t>${{</w:t>
+            </w:r>
+            <w:proofErr w:type="spellStart"/>
+            <w:r>
+              <w:rPr>
+                <w:rFonts w:ascii="Noto Sans" w:hAnsi="Noto Sans" w:cs="Noto Sans"/>
+                <w:sz w:val="14"/>
+                <w:szCs w:val="14"/>
+              </w:rPr>
+              <w:t>ptotal</w:t>
+            </w:r>
+            <w:proofErr w:type="spellEnd"/>
+            <w:r>
+              <w:rPr>
+                <w:rFonts w:ascii="Noto Sans" w:hAnsi="Noto Sans" w:cs="Noto Sans"/>
+                <w:sz w:val="14"/>
+                <w:szCs w:val="14"/>
+              </w:rPr>
+              <w:t>}}</w:t>
             </w:r>
           </w:p>
         </w:tc>
@@ -1114,7 +1240,25 @@
                 <w:sz w:val="14"/>
                 <w:szCs w:val="14"/>
               </w:rPr>
-              <w:t>{{GPStag}}</w:t>
+              <w:t>{{</w:t>
+            </w:r>
+            <w:proofErr w:type="spellStart"/>
+            <w:r>
+              <w:rPr>
+                <w:rFonts w:ascii="Noto Sans" w:hAnsi="Noto Sans" w:cs="Noto Sans"/>
+                <w:sz w:val="14"/>
+                <w:szCs w:val="14"/>
+              </w:rPr>
+              <w:t>GPStag</w:t>
+            </w:r>
+            <w:proofErr w:type="spellEnd"/>
+            <w:r>
+              <w:rPr>
+                <w:rFonts w:ascii="Noto Sans" w:hAnsi="Noto Sans" w:cs="Noto Sans"/>
+                <w:sz w:val="14"/>
+                <w:szCs w:val="14"/>
+              </w:rPr>
+              <w:t>}}</w:t>
             </w:r>
           </w:p>
         </w:tc>
@@ -1141,7 +1285,25 @@
                 <w:sz w:val="14"/>
                 <w:szCs w:val="14"/>
               </w:rPr>
-              <w:t>{{gpsbool}}</w:t>
+              <w:t>{{</w:t>
+            </w:r>
+            <w:proofErr w:type="spellStart"/>
+            <w:r>
+              <w:rPr>
+                <w:rFonts w:ascii="Noto Sans" w:hAnsi="Noto Sans" w:cs="Noto Sans"/>
+                <w:sz w:val="14"/>
+                <w:szCs w:val="14"/>
+              </w:rPr>
+              <w:t>gpsbool</w:t>
+            </w:r>
+            <w:proofErr w:type="spellEnd"/>
+            <w:r>
+              <w:rPr>
+                <w:rFonts w:ascii="Noto Sans" w:hAnsi="Noto Sans" w:cs="Noto Sans"/>
+                <w:sz w:val="14"/>
+                <w:szCs w:val="14"/>
+              </w:rPr>
+              <w:t>}}</w:t>
             </w:r>
           </w:p>
         </w:tc>
@@ -5735,7 +5897,25 @@
                 <w:sz w:val="14"/>
                 <w:szCs w:val="14"/>
               </w:rPr>
-              <w:t>{{plantag}}</w:t>
+              <w:t>{{</w:t>
+            </w:r>
+            <w:proofErr w:type="spellStart"/>
+            <w:r>
+              <w:rPr>
+                <w:rFonts w:ascii="Noto Sans" w:hAnsi="Noto Sans" w:cs="Noto Sans"/>
+                <w:sz w:val="14"/>
+                <w:szCs w:val="14"/>
+              </w:rPr>
+              <w:t>plantag</w:t>
+            </w:r>
+            <w:proofErr w:type="spellEnd"/>
+            <w:r>
+              <w:rPr>
+                <w:rFonts w:ascii="Noto Sans" w:hAnsi="Noto Sans" w:cs="Noto Sans"/>
+                <w:sz w:val="14"/>
+                <w:szCs w:val="14"/>
+              </w:rPr>
+              <w:t>}}</w:t>
             </w:r>
           </w:p>
         </w:tc>
@@ -9538,7 +9718,29 @@
           <w:sz w:val="14"/>
           <w:szCs w:val="14"/>
         </w:rPr>
-        <w:t>Para cualquier duda o aclaración escríbenos a info@firstlease.com.mx o llama al teléfono (55) 5160-5604</w:t>
+        <w:t xml:space="preserve">Para cualquier duda o aclaración escríbenos a info@firstlease.com.mx o </w:t>
+      </w:r>
+      <w:proofErr w:type="spellStart"/>
+      <w:r>
+        <w:rPr>
+          <w:rFonts w:ascii="Noto Sans" w:hAnsi="Noto Sans" w:cs="Noto Sans"/>
+          <w:b/>
+          <w:bCs/>
+          <w:sz w:val="14"/>
+          <w:szCs w:val="14"/>
+        </w:rPr>
+        <w:t>llama</w:t>
+      </w:r>
+      <w:proofErr w:type="spellEnd"/>
+      <w:r>
+        <w:rPr>
+          <w:rFonts w:ascii="Noto Sans" w:hAnsi="Noto Sans" w:cs="Noto Sans"/>
+          <w:b/>
+          <w:bCs/>
+          <w:sz w:val="14"/>
+          <w:szCs w:val="14"/>
+        </w:rPr>
+        <w:t xml:space="preserve"> al teléfono (55) 5160-5604</w:t>
       </w:r>
     </w:p>
     <w:p>
@@ -9563,7 +9765,7 @@
 </file>
 
 <file path=word/endnotes.xml><?xml version="1.0" encoding="utf-8"?>
-<w:endnotes xmlns:wpc="http://schemas.microsoft.com/office/word/2010/wordprocessingCanvas" xmlns:cx="http://schemas.microsoft.com/office/drawing/2014/chartex" xmlns:cx1="http://schemas.microsoft.com/office/drawing/2015/9/8/chartex" xmlns:cx2="http://schemas.microsoft.com/office/drawing/2015/10/21/chartex" xmlns:cx3="http://schemas.microsoft.com/office/drawing/2016/5/9/chartex" xmlns:cx4="http://schemas.microsoft.com/office/drawing/2016/5/10/chartex" xmlns:cx5="http://schemas.microsoft.com/office/drawing/2016/5/11/chartex" xmlns:cx6="http://schemas.microsoft.com/office/drawing/2016/5/12/chartex" xmlns:cx7="http://schemas.microsoft.com/office/drawing/2016/5/13/chartex" xmlns:cx8="http://schemas.microsoft.com/office/drawing/2016/5/14/chartex" xmlns:mc="http://schemas.openxmlformats.org/markup-compatibility/2006" xmlns:aink="http://schemas.microsoft.com/office/drawing/2016/ink" xmlns:am3d="http://schemas.microsoft.com/office/drawing/2017/model3d" xmlns:o="urn:schemas-microsoft-com:office:office" xmlns:oel="http://schemas.microsoft.com/office/2019/extlst" xmlns:r="http://schemas.openxmlformats.org/officeDocument/2006/relationships" xmlns:m="http://schemas.openxmlformats.org/officeDocument/2006/math" xmlns:v="urn:schemas-microsoft-com:vml" xmlns:wp14="http://schemas.microsoft.com/office/word/2010/wordprocessingDrawing" xmlns:wp="http://schemas.openxmlformats.org/drawingml/2006/wordprocessingDrawing" xmlns:w10="urn:schemas-microsoft-com:office:word" xmlns:w="http://schemas.openxmlformats.org/wordprocessingml/2006/main" xmlns:w14="http://schemas.microsoft.com/office/word/2010/wordml" xmlns:w15="http://schemas.microsoft.com/office/word/2012/wordml" xmlns:w16cex="http://schemas.microsoft.com/office/word/2018/wordml/cex" xmlns:w16cid="http://schemas.microsoft.com/office/word/2016/wordml/cid" xmlns:w16="http://schemas.microsoft.com/office/word/2018/wordml" xmlns:w16du="http://schemas.microsoft.com/office/word/2023/wordml/word16du" xmlns:w16sdtdh="http://schemas.microsoft.com/office/word/2020/wordml/sdtdatahash" xmlns:w16sdtfl="http://schemas.microsoft.com/office/word/2024/wordml/sdtformatlock" xmlns:w16se="http://schemas.microsoft.com/office/word/2015/wordml/symex" xmlns:wpg="http://schemas.microsoft.com/office/word/2010/wordprocessingGroup" xmlns:wpi="http://schemas.microsoft.com/office/word/2010/wordprocessingInk" xmlns:wne="http://schemas.microsoft.com/office/word/2006/wordml" xmlns:wps="http://schemas.microsoft.com/office/word/2010/wordprocessingShape" mc:Ignorable="w14 w15 w16se w16cid w16 w16cex w16sdtdh w16sdtfl w16du wp14">
+<w:endnotes xmlns:wpc="http://schemas.microsoft.com/office/word/2010/wordprocessingCanvas" xmlns:cx="http://schemas.microsoft.com/office/drawing/2014/chartex" xmlns:cx1="http://schemas.microsoft.com/office/drawing/2015/9/8/chartex" xmlns:cx2="http://schemas.microsoft.com/office/drawing/2015/10/21/chartex" xmlns:cx3="http://schemas.microsoft.com/office/drawing/2016/5/9/chartex" xmlns:cx4="http://schemas.microsoft.com/office/drawing/2016/5/10/chartex" xmlns:cx5="http://schemas.microsoft.com/office/drawing/2016/5/11/chartex" xmlns:cx6="http://schemas.microsoft.com/office/drawing/2016/5/12/chartex" xmlns:cx7="http://schemas.microsoft.com/office/drawing/2016/5/13/chartex" xmlns:cx8="http://schemas.microsoft.com/office/drawing/2016/5/14/chartex" xmlns:mc="http://schemas.openxmlformats.org/markup-compatibility/2006" xmlns:aink="http://schemas.microsoft.com/office/drawing/2016/ink" xmlns:am3d="http://schemas.microsoft.com/office/drawing/2017/model3d" xmlns:o="urn:schemas-microsoft-com:office:office" xmlns:oel="http://schemas.microsoft.com/office/2019/extlst" xmlns:r="http://schemas.openxmlformats.org/officeDocument/2006/relationships" xmlns:m="http://schemas.openxmlformats.org/officeDocument/2006/math" xmlns:v="urn:schemas-microsoft-com:vml" xmlns:wp14="http://schemas.microsoft.com/office/word/2010/wordprocessingDrawing" xmlns:wp="http://schemas.openxmlformats.org/drawingml/2006/wordprocessingDrawing" xmlns:w10="urn:schemas-microsoft-com:office:word" xmlns:w="http://schemas.openxmlformats.org/wordprocessingml/2006/main" xmlns:w14="http://schemas.microsoft.com/office/word/2010/wordml" xmlns:w15="http://schemas.microsoft.com/office/word/2012/wordml" xmlns:w16cei="http://schemas.microsoft.com/office/word/2026/wordml/cei" xmlns:w16cex="http://schemas.microsoft.com/office/word/2018/wordml/cex" xmlns:w16cid="http://schemas.microsoft.com/office/word/2016/wordml/cid" xmlns:w16="http://schemas.microsoft.com/office/word/2018/wordml" xmlns:w16du="http://schemas.microsoft.com/office/word/2023/wordml/word16du" xmlns:w16sdtdh="http://schemas.microsoft.com/office/word/2020/wordml/sdtdatahash" xmlns:w16sdtfl="http://schemas.microsoft.com/office/word/2024/wordml/sdtformatlock" xmlns:w16se="http://schemas.microsoft.com/office/word/2015/wordml/symex" xmlns:wpg="http://schemas.microsoft.com/office/word/2010/wordprocessingGroup" xmlns:wpi="http://schemas.microsoft.com/office/word/2010/wordprocessingInk" xmlns:wne="http://schemas.microsoft.com/office/word/2006/wordml" xmlns:wps="http://schemas.microsoft.com/office/word/2010/wordprocessingShape" mc:Ignorable="w14 w15 w16se w16cid w16 w16cex w16sdtdh w16sdtfl w16du wp14">
   <w:endnote w:type="separator" w:id="-1">
     <w:p>
       <w:pPr>
@@ -9588,7 +9790,7 @@
 </file>
 
 <file path=word/footer1.xml><?xml version="1.0" encoding="utf-8"?>
-<w:ftr xmlns:wpc="http://schemas.microsoft.com/office/word/2010/wordprocessingCanvas" xmlns:cx="http://schemas.microsoft.com/office/drawing/2014/chartex" xmlns:cx1="http://schemas.microsoft.com/office/drawing/2015/9/8/chartex" xmlns:cx2="http://schemas.microsoft.com/office/drawing/2015/10/21/chartex" xmlns:cx3="http://schemas.microsoft.com/office/drawing/2016/5/9/chartex" xmlns:cx4="http://schemas.microsoft.com/office/drawing/2016/5/10/chartex" xmlns:cx5="http://schemas.microsoft.com/office/drawing/2016/5/11/chartex" xmlns:cx6="http://schemas.microsoft.com/office/drawing/2016/5/12/chartex" xmlns:cx7="http://schemas.microsoft.com/office/drawing/2016/5/13/chartex" xmlns:cx8="http://schemas.microsoft.com/office/drawing/2016/5/14/chartex" xmlns:mc="http://schemas.openxmlformats.org/markup-compatibility/2006" xmlns:aink="http://schemas.microsoft.com/office/drawing/2016/ink" xmlns:am3d="http://schemas.microsoft.com/office/drawing/2017/model3d" xmlns:o="urn:schemas-microsoft-com:office:office" xmlns:oel="http://schemas.microsoft.com/office/2019/extlst" xmlns:r="http://schemas.openxmlformats.org/officeDocument/2006/relationships" xmlns:m="http://schemas.openxmlformats.org/officeDocument/2006/math" xmlns:v="urn:schemas-microsoft-com:vml" xmlns:wp14="http://schemas.microsoft.com/office/word/2010/wordprocessingDrawing" xmlns:wp="http://schemas.openxmlformats.org/drawingml/2006/wordprocessingDrawing" xmlns:w10="urn:schemas-microsoft-com:office:word" xmlns:w="http://schemas.openxmlformats.org/wordprocessingml/2006/main" xmlns:w14="http://schemas.microsoft.com/office/word/2010/wordml" xmlns:w15="http://schemas.microsoft.com/office/word/2012/wordml" xmlns:w16cex="http://schemas.microsoft.com/office/word/2018/wordml/cex" xmlns:w16cid="http://schemas.microsoft.com/office/word/2016/wordml/cid" xmlns:w16="http://schemas.microsoft.com/office/word/2018/wordml" xmlns:w16du="http://schemas.microsoft.com/office/word/2023/wordml/word16du" xmlns:w16sdtdh="http://schemas.microsoft.com/office/word/2020/wordml/sdtdatahash" xmlns:w16sdtfl="http://schemas.microsoft.com/office/word/2024/wordml/sdtformatlock" xmlns:w16se="http://schemas.microsoft.com/office/word/2015/wordml/symex" xmlns:wpg="http://schemas.microsoft.com/office/word/2010/wordprocessingGroup" xmlns:wpi="http://schemas.microsoft.com/office/word/2010/wordprocessingInk" xmlns:wne="http://schemas.microsoft.com/office/word/2006/wordml" xmlns:wps="http://schemas.microsoft.com/office/word/2010/wordprocessingShape" mc:Ignorable="w14 w15 w16se w16cid w16 w16cex w16sdtdh w16sdtfl w16du wp14">
+<w:ftr xmlns:wpc="http://schemas.microsoft.com/office/word/2010/wordprocessingCanvas" xmlns:cx="http://schemas.microsoft.com/office/drawing/2014/chartex" xmlns:cx1="http://schemas.microsoft.com/office/drawing/2015/9/8/chartex" xmlns:cx2="http://schemas.microsoft.com/office/drawing/2015/10/21/chartex" xmlns:cx3="http://schemas.microsoft.com/office/drawing/2016/5/9/chartex" xmlns:cx4="http://schemas.microsoft.com/office/drawing/2016/5/10/chartex" xmlns:cx5="http://schemas.microsoft.com/office/drawing/2016/5/11/chartex" xmlns:cx6="http://schemas.microsoft.com/office/drawing/2016/5/12/chartex" xmlns:cx7="http://schemas.microsoft.com/office/drawing/2016/5/13/chartex" xmlns:cx8="http://schemas.microsoft.com/office/drawing/2016/5/14/chartex" xmlns:mc="http://schemas.openxmlformats.org/markup-compatibility/2006" xmlns:aink="http://schemas.microsoft.com/office/drawing/2016/ink" xmlns:am3d="http://schemas.microsoft.com/office/drawing/2017/model3d" xmlns:o="urn:schemas-microsoft-com:office:office" xmlns:oel="http://schemas.microsoft.com/office/2019/extlst" xmlns:r="http://schemas.openxmlformats.org/officeDocument/2006/relationships" xmlns:m="http://schemas.openxmlformats.org/officeDocument/2006/math" xmlns:v="urn:schemas-microsoft-com:vml" xmlns:wp14="http://schemas.microsoft.com/office/word/2010/wordprocessingDrawing" xmlns:wp="http://schemas.openxmlformats.org/drawingml/2006/wordprocessingDrawing" xmlns:w10="urn:schemas-microsoft-com:office:word" xmlns:w="http://schemas.openxmlformats.org/wordprocessingml/2006/main" xmlns:w14="http://schemas.microsoft.com/office/word/2010/wordml" xmlns:w15="http://schemas.microsoft.com/office/word/2012/wordml" xmlns:w16cei="http://schemas.microsoft.com/office/word/2026/wordml/cei" xmlns:w16cex="http://schemas.microsoft.com/office/word/2018/wordml/cex" xmlns:w16cid="http://schemas.microsoft.com/office/word/2016/wordml/cid" xmlns:w16="http://schemas.microsoft.com/office/word/2018/wordml" xmlns:w16du="http://schemas.microsoft.com/office/word/2023/wordml/word16du" xmlns:w16sdtdh="http://schemas.microsoft.com/office/word/2020/wordml/sdtdatahash" xmlns:w16sdtfl="http://schemas.microsoft.com/office/word/2024/wordml/sdtformatlock" xmlns:w16se="http://schemas.microsoft.com/office/word/2015/wordml/symex" xmlns:wpg="http://schemas.microsoft.com/office/word/2010/wordprocessingGroup" xmlns:wpi="http://schemas.microsoft.com/office/word/2010/wordprocessingInk" xmlns:wne="http://schemas.microsoft.com/office/word/2006/wordml" xmlns:wps="http://schemas.microsoft.com/office/word/2010/wordprocessingShape" mc:Ignorable="w14 w15 w16se w16cid w16 w16cex w16sdtdh w16sdtfl w16du wp14">
   <w:p>
     <w:pPr>
       <w:pStyle w:val="Piedepgina"/>
@@ -9705,7 +9907,27 @@
         <w:sz w:val="14"/>
         <w:szCs w:val="14"/>
       </w:rPr>
-      <w:t>Cracovia 72, torre B, oficina VIP01, San Ángel, Álvaro Obregón, 01000, Ciudad de México</w:t>
+      <w:t>Cracovia 72, torre B, oficina VIP0</w:t>
+    </w:r>
+    <w:r>
+      <w:rPr>
+        <w:rFonts w:ascii="Arial Nova Light" w:hAnsi="Arial Nova Light" w:cs="Calibri Light"/>
+        <w:noProof/>
+        <w:color w:val="074B74"/>
+        <w:sz w:val="14"/>
+        <w:szCs w:val="14"/>
+      </w:rPr>
+      <w:t>2</w:t>
+    </w:r>
+    <w:r>
+      <w:rPr>
+        <w:rFonts w:ascii="Arial Nova Light" w:hAnsi="Arial Nova Light" w:cs="Calibri Light"/>
+        <w:noProof/>
+        <w:color w:val="074B74"/>
+        <w:sz w:val="14"/>
+        <w:szCs w:val="14"/>
+      </w:rPr>
+      <w:t>, San Ángel, Álvaro Obregón, 01000, Ciudad de México</w:t>
     </w:r>
   </w:p>
   <w:p>
@@ -9717,7 +9939,7 @@
 </file>
 
 <file path=word/footnotes.xml><?xml version="1.0" encoding="utf-8"?>
-<w:footnotes xmlns:wpc="http://schemas.microsoft.com/office/word/2010/wordprocessingCanvas" xmlns:cx="http://schemas.microsoft.com/office/drawing/2014/chartex" xmlns:cx1="http://schemas.microsoft.com/office/drawing/2015/9/8/chartex" xmlns:cx2="http://schemas.microsoft.com/office/drawing/2015/10/21/chartex" xmlns:cx3="http://schemas.microsoft.com/office/drawing/2016/5/9/chartex" xmlns:cx4="http://schemas.microsoft.com/office/drawing/2016/5/10/chartex" xmlns:cx5="http://schemas.microsoft.com/office/drawing/2016/5/11/chartex" xmlns:cx6="http://schemas.microsoft.com/office/drawing/2016/5/12/chartex" xmlns:cx7="http://schemas.microsoft.com/office/drawing/2016/5/13/chartex" xmlns:cx8="http://schemas.microsoft.com/office/drawing/2016/5/14/chartex" xmlns:mc="http://schemas.openxmlformats.org/markup-compatibility/2006" xmlns:aink="http://schemas.microsoft.com/office/drawing/2016/ink" xmlns:am3d="http://schemas.microsoft.com/office/drawing/2017/model3d" xmlns:o="urn:schemas-microsoft-com:office:office" xmlns:oel="http://schemas.microsoft.com/office/2019/extlst" xmlns:r="http://schemas.openxmlformats.org/officeDocument/2006/relationships" xmlns:m="http://schemas.openxmlformats.org/officeDocument/2006/math" xmlns:v="urn:schemas-microsoft-com:vml" xmlns:wp14="http://schemas.microsoft.com/office/word/2010/wordprocessingDrawing" xmlns:wp="http://schemas.openxmlformats.org/drawingml/2006/wordprocessingDrawing" xmlns:w10="urn:schemas-microsoft-com:office:word" xmlns:w="http://schemas.openxmlformats.org/wordprocessingml/2006/main" xmlns:w14="http://schemas.microsoft.com/office/word/2010/wordml" xmlns:w15="http://schemas.microsoft.com/office/word/2012/wordml" xmlns:w16cex="http://schemas.microsoft.com/office/word/2018/wordml/cex" xmlns:w16cid="http://schemas.microsoft.com/office/word/2016/wordml/cid" xmlns:w16="http://schemas.microsoft.com/office/word/2018/wordml" xmlns:w16du="http://schemas.microsoft.com/office/word/2023/wordml/word16du" xmlns:w16sdtdh="http://schemas.microsoft.com/office/word/2020/wordml/sdtdatahash" xmlns:w16sdtfl="http://schemas.microsoft.com/office/word/2024/wordml/sdtformatlock" xmlns:w16se="http://schemas.microsoft.com/office/word/2015/wordml/symex" xmlns:wpg="http://schemas.microsoft.com/office/word/2010/wordprocessingGroup" xmlns:wpi="http://schemas.microsoft.com/office/word/2010/wordprocessingInk" xmlns:wne="http://schemas.microsoft.com/office/word/2006/wordml" xmlns:wps="http://schemas.microsoft.com/office/word/2010/wordprocessingShape" mc:Ignorable="w14 w15 w16se w16cid w16 w16cex w16sdtdh w16sdtfl w16du wp14">
+<w:footnotes xmlns:wpc="http://schemas.microsoft.com/office/word/2010/wordprocessingCanvas" xmlns:cx="http://schemas.microsoft.com/office/drawing/2014/chartex" xmlns:cx1="http://schemas.microsoft.com/office/drawing/2015/9/8/chartex" xmlns:cx2="http://schemas.microsoft.com/office/drawing/2015/10/21/chartex" xmlns:cx3="http://schemas.microsoft.com/office/drawing/2016/5/9/chartex" xmlns:cx4="http://schemas.microsoft.com/office/drawing/2016/5/10/chartex" xmlns:cx5="http://schemas.microsoft.com/office/drawing/2016/5/11/chartex" xmlns:cx6="http://schemas.microsoft.com/office/drawing/2016/5/12/chartex" xmlns:cx7="http://schemas.microsoft.com/office/drawing/2016/5/13/chartex" xmlns:cx8="http://schemas.microsoft.com/office/drawing/2016/5/14/chartex" xmlns:mc="http://schemas.openxmlformats.org/markup-compatibility/2006" xmlns:aink="http://schemas.microsoft.com/office/drawing/2016/ink" xmlns:am3d="http://schemas.microsoft.com/office/drawing/2017/model3d" xmlns:o="urn:schemas-microsoft-com:office:office" xmlns:oel="http://schemas.microsoft.com/office/2019/extlst" xmlns:r="http://schemas.openxmlformats.org/officeDocument/2006/relationships" xmlns:m="http://schemas.openxmlformats.org/officeDocument/2006/math" xmlns:v="urn:schemas-microsoft-com:vml" xmlns:wp14="http://schemas.microsoft.com/office/word/2010/wordprocessingDrawing" xmlns:wp="http://schemas.openxmlformats.org/drawingml/2006/wordprocessingDrawing" xmlns:w10="urn:schemas-microsoft-com:office:word" xmlns:w="http://schemas.openxmlformats.org/wordprocessingml/2006/main" xmlns:w14="http://schemas.microsoft.com/office/word/2010/wordml" xmlns:w15="http://schemas.microsoft.com/office/word/2012/wordml" xmlns:w16cei="http://schemas.microsoft.com/office/word/2026/wordml/cei" xmlns:w16cex="http://schemas.microsoft.com/office/word/2018/wordml/cex" xmlns:w16cid="http://schemas.microsoft.com/office/word/2016/wordml/cid" xmlns:w16="http://schemas.microsoft.com/office/word/2018/wordml" xmlns:w16du="http://schemas.microsoft.com/office/word/2023/wordml/word16du" xmlns:w16sdtdh="http://schemas.microsoft.com/office/word/2020/wordml/sdtdatahash" xmlns:w16sdtfl="http://schemas.microsoft.com/office/word/2024/wordml/sdtformatlock" xmlns:w16se="http://schemas.microsoft.com/office/word/2015/wordml/symex" xmlns:wpg="http://schemas.microsoft.com/office/word/2010/wordprocessingGroup" xmlns:wpi="http://schemas.microsoft.com/office/word/2010/wordprocessingInk" xmlns:wne="http://schemas.microsoft.com/office/word/2006/wordml" xmlns:wps="http://schemas.microsoft.com/office/word/2010/wordprocessingShape" mc:Ignorable="w14 w15 w16se w16cid w16 w16cex w16sdtdh w16sdtfl w16du wp14">
   <w:footnote w:type="separator" w:id="-1">
     <w:p>
       <w:pPr>
@@ -9742,7 +9964,7 @@
 </file>
 
 <file path=word/numbering.xml><?xml version="1.0" encoding="utf-8"?>
-<w:numbering xmlns:wpc="http://schemas.microsoft.com/office/word/2010/wordprocessingCanvas" xmlns:cx="http://schemas.microsoft.com/office/drawing/2014/chartex" xmlns:cx1="http://schemas.microsoft.com/office/drawing/2015/9/8/chartex" xmlns:cx2="http://schemas.microsoft.com/office/drawing/2015/10/21/chartex" xmlns:cx3="http://schemas.microsoft.com/office/drawing/2016/5/9/chartex" xmlns:cx4="http://schemas.microsoft.com/office/drawing/2016/5/10/chartex" xmlns:cx5="http://schemas.microsoft.com/office/drawing/2016/5/11/chartex" xmlns:cx6="http://schemas.microsoft.com/office/drawing/2016/5/12/chartex" xmlns:cx7="http://schemas.microsoft.com/office/drawing/2016/5/13/chartex" xmlns:cx8="http://schemas.microsoft.com/office/drawing/2016/5/14/chartex" xmlns:mc="http://schemas.openxmlformats.org/markup-compatibility/2006" xmlns:aink="http://schemas.microsoft.com/office/drawing/2016/ink" xmlns:am3d="http://schemas.microsoft.com/office/drawing/2017/model3d" xmlns:o="urn:schemas-microsoft-com:office:office" xmlns:oel="http://schemas.microsoft.com/office/2019/extlst" xmlns:r="http://schemas.openxmlformats.org/officeDocument/2006/relationships" xmlns:m="http://schemas.openxmlformats.org/officeDocument/2006/math" xmlns:v="urn:schemas-microsoft-com:vml" xmlns:wp14="http://schemas.microsoft.com/office/word/2010/wordprocessingDrawing" xmlns:wp="http://schemas.openxmlformats.org/drawingml/2006/wordprocessingDrawing" xmlns:w10="urn:schemas-microsoft-com:office:word" xmlns:w="http://schemas.openxmlformats.org/wordprocessingml/2006/main" xmlns:w14="http://schemas.microsoft.com/office/word/2010/wordml" xmlns:w15="http://schemas.microsoft.com/office/word/2012/wordml" xmlns:w16cex="http://schemas.microsoft.com/office/word/2018/wordml/cex" xmlns:w16cid="http://schemas.microsoft.com/office/word/2016/wordml/cid" xmlns:w16="http://schemas.microsoft.com/office/word/2018/wordml" xmlns:w16du="http://schemas.microsoft.com/office/word/2023/wordml/word16du" xmlns:w16sdtdh="http://schemas.microsoft.com/office/word/2020/wordml/sdtdatahash" xmlns:w16sdtfl="http://schemas.microsoft.com/office/word/2024/wordml/sdtformatlock" xmlns:w16se="http://schemas.microsoft.com/office/word/2015/wordml/symex" xmlns:wpg="http://schemas.microsoft.com/office/word/2010/wordprocessingGroup" xmlns:wpi="http://schemas.microsoft.com/office/word/2010/wordprocessingInk" xmlns:wne="http://schemas.microsoft.com/office/word/2006/wordml" xmlns:wps="http://schemas.microsoft.com/office/word/2010/wordprocessingShape" mc:Ignorable="w14 w15 w16se w16cid w16 w16cex w16sdtdh w16sdtfl w16du wp14">
+<w:numbering xmlns:wpc="http://schemas.microsoft.com/office/word/2010/wordprocessingCanvas" xmlns:cx="http://schemas.microsoft.com/office/drawing/2014/chartex" xmlns:cx1="http://schemas.microsoft.com/office/drawing/2015/9/8/chartex" xmlns:cx2="http://schemas.microsoft.com/office/drawing/2015/10/21/chartex" xmlns:cx3="http://schemas.microsoft.com/office/drawing/2016/5/9/chartex" xmlns:cx4="http://schemas.microsoft.com/office/drawing/2016/5/10/chartex" xmlns:cx5="http://schemas.microsoft.com/office/drawing/2016/5/11/chartex" xmlns:cx6="http://schemas.microsoft.com/office/drawing/2016/5/12/chartex" xmlns:cx7="http://schemas.microsoft.com/office/drawing/2016/5/13/chartex" xmlns:cx8="http://schemas.microsoft.com/office/drawing/2016/5/14/chartex" xmlns:mc="http://schemas.openxmlformats.org/markup-compatibility/2006" xmlns:aink="http://schemas.microsoft.com/office/drawing/2016/ink" xmlns:am3d="http://schemas.microsoft.com/office/drawing/2017/model3d" xmlns:o="urn:schemas-microsoft-com:office:office" xmlns:oel="http://schemas.microsoft.com/office/2019/extlst" xmlns:r="http://schemas.openxmlformats.org/officeDocument/2006/relationships" xmlns:m="http://schemas.openxmlformats.org/officeDocument/2006/math" xmlns:v="urn:schemas-microsoft-com:vml" xmlns:wp14="http://schemas.microsoft.com/office/word/2010/wordprocessingDrawing" xmlns:wp="http://schemas.openxmlformats.org/drawingml/2006/wordprocessingDrawing" xmlns:w10="urn:schemas-microsoft-com:office:word" xmlns:w="http://schemas.openxmlformats.org/wordprocessingml/2006/main" xmlns:w14="http://schemas.microsoft.com/office/word/2010/wordml" xmlns:w15="http://schemas.microsoft.com/office/word/2012/wordml" xmlns:w16cei="http://schemas.microsoft.com/office/word/2026/wordml/cei" xmlns:w16cex="http://schemas.microsoft.com/office/word/2018/wordml/cex" xmlns:w16cid="http://schemas.microsoft.com/office/word/2016/wordml/cid" xmlns:w16="http://schemas.microsoft.com/office/word/2018/wordml" xmlns:w16du="http://schemas.microsoft.com/office/word/2023/wordml/word16du" xmlns:w16sdtdh="http://schemas.microsoft.com/office/word/2020/wordml/sdtdatahash" xmlns:w16sdtfl="http://schemas.microsoft.com/office/word/2024/wordml/sdtformatlock" xmlns:w16se="http://schemas.microsoft.com/office/word/2015/wordml/symex" xmlns:wpg="http://schemas.microsoft.com/office/word/2010/wordprocessingGroup" xmlns:wpi="http://schemas.microsoft.com/office/word/2010/wordprocessingInk" xmlns:wne="http://schemas.microsoft.com/office/word/2006/wordml" xmlns:wps="http://schemas.microsoft.com/office/word/2010/wordprocessingShape" mc:Ignorable="w14 w15 w16se w16cid w16 w16cex w16sdtdh w16sdtfl w16du wp14">
   <w:abstractNum w:abstractNumId="0" w15:restartNumberingAfterBreak="0">
     <w:nsid w:val="3DFF10E4"/>
     <w:multiLevelType w:val="hybridMultilevel"/>
@@ -11161,12 +11383,14 @@
 </file>
 
 <file path=customXml/item1.xml><?xml version="1.0" encoding="utf-8"?>
-<?mso-contentType ?>
-<FormTemplates xmlns="http://schemas.microsoft.com/sharepoint/v3/contenttype/forms">
-  <Display>DocumentLibraryForm</Display>
-  <Edit>DocumentLibraryForm</Edit>
-  <New>DocumentLibraryForm</New>
-</FormTemplates>
+<p:properties xmlns:p="http://schemas.microsoft.com/office/2006/metadata/properties" xmlns:xsi="http://www.w3.org/2001/XMLSchema-instance" xmlns:pc="http://schemas.microsoft.com/office/infopath/2007/PartnerControls">
+  <documentManagement>
+    <TaxCatchAll xmlns="28d91c81-3320-4acb-8eaa-397b4c3aa27d" xsi:nil="true"/>
+    <lcf76f155ced4ddcb4097134ff3c332f xmlns="67d34832-0f6e-4f48-b623-8e6599d3f193">
+      <Terms xmlns="http://schemas.microsoft.com/office/infopath/2007/PartnerControls"/>
+    </lcf76f155ced4ddcb4097134ff3c332f>
+  </documentManagement>
+</p:properties>
 </file>
 
 <file path=customXml/item2.xml><?xml version="1.0" encoding="utf-8"?>
@@ -11425,20 +11649,21 @@
 </file>
 
 <file path=customXml/item3.xml><?xml version="1.0" encoding="utf-8"?>
-<p:properties xmlns:p="http://schemas.microsoft.com/office/2006/metadata/properties" xmlns:xsi="http://www.w3.org/2001/XMLSchema-instance" xmlns:pc="http://schemas.microsoft.com/office/infopath/2007/PartnerControls">
-  <documentManagement>
-    <TaxCatchAll xmlns="28d91c81-3320-4acb-8eaa-397b4c3aa27d" xsi:nil="true"/>
-    <lcf76f155ced4ddcb4097134ff3c332f xmlns="67d34832-0f6e-4f48-b623-8e6599d3f193">
-      <Terms xmlns="http://schemas.microsoft.com/office/infopath/2007/PartnerControls"/>
-    </lcf76f155ced4ddcb4097134ff3c332f>
-  </documentManagement>
-</p:properties>
+<?mso-contentType ?>
+<FormTemplates xmlns="http://schemas.microsoft.com/sharepoint/v3/contenttype/forms">
+  <Display>DocumentLibraryForm</Display>
+  <Edit>DocumentLibraryForm</Edit>
+  <New>DocumentLibraryForm</New>
+</FormTemplates>
 </file>
 
 <file path=customXml/itemProps1.xml><?xml version="1.0" encoding="utf-8"?>
-<ds:datastoreItem xmlns:ds="http://schemas.openxmlformats.org/officeDocument/2006/customXml" ds:itemID="{9D305735-070E-403E-93D1-14A21296DD3F}">
+<ds:datastoreItem xmlns:ds="http://schemas.openxmlformats.org/officeDocument/2006/customXml" ds:itemID="{1CD89225-DC72-4085-AD2F-3338BC9C5280}">
   <ds:schemaRefs>
-    <ds:schemaRef ds:uri="http://schemas.microsoft.com/sharepoint/v3/contenttype/forms"/>
+    <ds:schemaRef ds:uri="http://schemas.microsoft.com/office/2006/metadata/properties"/>
+    <ds:schemaRef ds:uri="http://schemas.microsoft.com/office/infopath/2007/PartnerControls"/>
+    <ds:schemaRef ds:uri="28d91c81-3320-4acb-8eaa-397b4c3aa27d"/>
+    <ds:schemaRef ds:uri="67d34832-0f6e-4f48-b623-8e6599d3f193"/>
   </ds:schemaRefs>
 </ds:datastoreItem>
 </file>
@@ -11463,12 +11688,9 @@
 </file>
 
 <file path=customXml/itemProps3.xml><?xml version="1.0" encoding="utf-8"?>
-<ds:datastoreItem xmlns:ds="http://schemas.openxmlformats.org/officeDocument/2006/customXml" ds:itemID="{1CD89225-DC72-4085-AD2F-3338BC9C5280}">
+<ds:datastoreItem xmlns:ds="http://schemas.openxmlformats.org/officeDocument/2006/customXml" ds:itemID="{9D305735-070E-403E-93D1-14A21296DD3F}">
   <ds:schemaRefs>
-    <ds:schemaRef ds:uri="http://schemas.microsoft.com/office/2006/metadata/properties"/>
-    <ds:schemaRef ds:uri="http://schemas.microsoft.com/office/infopath/2007/PartnerControls"/>
-    <ds:schemaRef ds:uri="28d91c81-3320-4acb-8eaa-397b4c3aa27d"/>
-    <ds:schemaRef ds:uri="67d34832-0f6e-4f48-b623-8e6599d3f193"/>
+    <ds:schemaRef ds:uri="http://schemas.microsoft.com/sharepoint/v3/contenttype/forms"/>
   </ds:schemaRefs>
 </ds:datastoreItem>
 </file>
</xml_diff>